<commit_message>
Deepen theoretical anchoring of U18 paper for A-journal submission
Add trust-in-technology literature stream (McKnight, Lankton, Söllner,
Kuen meta-analysis, trust/distrust distinction), attitude-strength
tradition as second pillar of the experience effect (Fazio & Zanna,
Glasman & Albarracín), e-voting field evidence (Salta, Estonia, UK
conjoint, Abdala, Avgerou), and verifiability usability literature
(Marky, Kulyk, Hilt incl. second-device verification). Replace weak
references, verify key DOIs via Scite, update references list.

Co-Authored-By: Claude Fable 5 <noreply@anthropic.com>
Claude-Session: https://claude.ai/code/session_01HtXFYU9REMYtX7Q3tX74vu
</commit_message>
<xml_diff>
--- a/u18-wahl-publikationen/paper/U18_Paper_v6_Trying_Is_Not_Trusting.docx
+++ b/u18-wahl-publikationen/paper/U18_Paper_v6_Trying_Is_Not_Trusting.docx
@@ -104,7 +104,7 @@
         <w:jc w:val="both"/>
       </w:pPr>
       <w:r>
-        <w:t>This administrative detail creates an unusual research opportunity. The central open question in digital voting research is not whether people say they would accept internet voting. It is what actually happens to acceptance and trust when people use a real system in a real election, compared to merely imagining one. Existing acceptance studies rely overwhelmingly on hypothetical scenarios rated by convenience samples (Carter &amp; Bélanger, 2005; Schaupp &amp; Carter, 2005; Apaua &amp; Lallie, 2022). The few field settings that exist, Estonia above all, confound experience with self-selection: those who vote online are those who already wanted to (Solvak &amp; Vassil, 2016). A comparison in which experienced and hypothetical evaluators are separated by residence rather than by choice, answer an identical instrument, and do so minutes after casting a real vote is, to our knowledge, not available elsewhere in the literature.</w:t>
+        <w:t>This administrative detail creates an unusual research opportunity. The central open question in digital voting research is not whether people say they would accept internet voting. It is what actually happens to acceptance and trust when people use a real system in a real election, compared to merely imagining one. Existing acceptance studies rely overwhelmingly on hypothetical scenarios rated by convenience samples (Carter &amp; Bélanger, 2005; Schaupp &amp; Carter, 2005; Warkentin et al., 2018). The few field settings that exist confound experience with self-selection: in Estonia, those who vote online are those who already wanted to (Solvak &amp; Vassil, 2016; Ehin et al., 2022), and the one field experiment that varied voting technology, in Salta, Argentina, compared machines within polling stations rather than remote voting from home (Alvarez et al., 2013). A comparison in which experienced and hypothetical evaluators are separated by residence rather than by choice, answer an identical instrument, and do so minutes after casting a real vote is, to our knowledge, not available elsewhere in the literature.</w:t>
       </w:r>
     </w:p>
     <w:p>
@@ -173,6 +173,14 @@
     </w:p>
     <w:p>
       <w:pPr>
+        <w:jc w:val="both"/>
+      </w:pPr>
+      <w:r>
+        <w:t>The attitude-strength tradition makes the same prediction through a different mechanism and gives it four decades of experimental backing. Attitudes formed through direct behavioral experience with an object are more accessible, held with more confidence, more stable, and more predictive of later behavior than attitudes formed through indirect information (Regan &amp; Fazio, 1977; Fazio &amp; Zanna, 1981); a meta-analysis across 128 conditions confirms direct experience as one of the strongest moderators of the attitude–behavior link (Glasman &amp; Albarracín, 2006). The marketing analogue is exact: attitudes based on product trial predict purchase, attitudes based on advertising barely do (Smith &amp; Swinyard, 1983). A voting pilot is a trial. The prediction that follows is not merely that the digital group reports higher acceptance, but that experience-based acceptance is the more behaviorally consequential kind, which is what makes the pilot-versus-campaign question a fair fight worth settling empirically.</w:t>
+      </w:r>
+    </w:p>
+    <w:p>
+      <w:pPr>
         <w:pStyle w:val="Heading3"/>
       </w:pPr>
       <w:r>
@@ -184,7 +192,15 @@
         <w:jc w:val="both"/>
       </w:pPr>
       <w:r>
-        <w:t>Trust in digital voting is a different belief with a different object structure. Following Carter and Bélanger (2005) and the institution-based trust tradition (Zucker, 1986; McKnight et al., 2002), we measure three trust layers: technology trust (the system works reliably, keeps the ballot secret, resists manipulation), institutional trust (the responsible institutions run elections fairly and protect my vote), and generic trust in the procedure of digital voting. These are validity beliefs: judgments about whether the election, as an institution, remains intact when it becomes digital. Two properties distinguish validity beliefs from propriety beliefs. They refer to properties a user cannot observe in use: a smooth voting session reveals nothing about server-side integrity. And they are anchored in dispositions and prior attitudes toward the state and toward technology rather than in episodic evidence (Warkentin et al., 2018). Both properties predict that experience should move trust much less than acceptance. A pleasant user experience is simply not evidence about the things trust is about.</w:t>
+        <w:t>Trust in digital voting is a different belief with a different object structure. Trust research has moved from treating trust as one holistic judgment to distinguishing trust objects: trust in a specific technology has its own components (reliability, functionality, helpfulness) and its own measurement tradition, separate from trust in people or providers (McKnight et al., 2011; Lankton et al., 2015), and which trust relationship matters depends on which target the user must rely on (Söllner et al., 2016). A recent meta-analysis shows that trust in technology and trust in provider carry distinct antecedent structures, familiarity feeding the former and institution-based assurance the latter, and that model results shift materially depending on which entities are specified (Kuen et al., 2023). The e-voting literature has begun to adopt this differentiation: trust in government and trust in technology contribute separately to internet-voting intention in Estonia (Abdala et al., 2025), multi-dimensional technology trust predicts e-voting intention (Zhu et al., 2021), and trust in e-voting has been theorized as political trust in a socio-technical arrangement in which perceptions of the technology and of the electoral authority are interdependent (Avgerou, 2013).</w:t>
+      </w:r>
+    </w:p>
+    <w:p>
+      <w:pPr>
+        <w:jc w:val="both"/>
+      </w:pPr>
+      <w:r>
+        <w:t>Following Carter and Bélanger (2005) and the institution-based trust tradition (Zucker, 1986; McKnight et al., 2002), we therefore measure three trust layers: technology trust (the system works reliably, keeps the ballot secret, resists manipulation), institutional trust (the responsible institutions run elections fairly and protect my vote), and generic trust in the procedure of digital voting. These are validity beliefs: judgments about whether the election, as an institution, remains intact when it becomes digital. Two properties distinguish validity beliefs from propriety beliefs. They refer to properties a user cannot observe in use: a smooth voting session reveals nothing about server-side integrity, and post-use trust accordingly draws on perceptions accumulated around the technology's institutional context rather than on the transaction alone (Hernández-Ortega, 2011). And they are anchored in dispositions and prior attitudes toward the state and toward technology rather than in episodic evidence (Warkentin et al., 2018); prior attitudes have been shown to govern how people interpret subsequent direct experience with an institution, rather than being overwritten by it (Rosenbaum et al., 2005). Both properties predict that experience should move trust much less than acceptance. A pleasant user experience is simply not evidence about the things trust is about. Field data point the same way: in the Salta e-voting field experiment, voters found the new technology easier and supported its adoption while concerns about ballot secrecy persisted (Alvarez et al., 2013), and in a UK conjoint experiment internet voting was perceived as less trustworthy than in-person voting across the board, with integrity concerns dominating support (Turnbull-Dugarte &amp; Devine, 2023).</w:t>
       </w:r>
     </w:p>
     <w:p>
@@ -200,7 +216,7 @@
         <w:jc w:val="both"/>
       </w:pPr>
       <w:r>
-        <w:t>Cryptographic end-to-end verifiability decomposes into cast-as-intended, recorded-as-cast, and tallied-as-recorded guarantees, with individual verification (a voter checks her own ballot) distinct from universal verification (anyone checks the tally) (Chaum, 2004; Benaloh, 2006; Adida, 2008). The system studied here implemented individual recorded-as-cast verification: after voting, a voter could check that her ballot had arrived in the digital ballot box. In trust terms, this function targets exactly the technology trust layer; it replaces a promise with a checkable receipt. Whether it works psychologically is an open question. Laboratory studies of verifiable systems find that voters can rarely explain what verification proves (Acemyan et al., 2014), and the German Federal Constitutional Court has made public comprehensibility without special expertise a constitutional condition for electronic voting (BVerfG, 2009). A field test of whether experienced verifiability produces comprehension and trust has been missing.</w:t>
+        <w:t>Cryptographic end-to-end verifiability decomposes into cast-as-intended, recorded-as-cast, and tallied-as-recorded guarantees, with individual verification (a voter checks her own ballot) distinct from universal verification (anyone checks the tally) (Chaum, 2004; Benaloh, 2006; Adida, 2008). The system studied here implemented individual recorded-as-cast verification: after voting, a voter could check that her ballot had arrived in the digital ballot box. In trust terms, this function targets exactly the technology trust layer; it replaces a promise with a checkable receipt. Whether it works psychologically is an open question with mounting negative evidence. Laboratory studies of verifiable systems find severe usability problems and voters who can rarely explain what verification proves (Karayumak et al., 2011; Acemyan et al., 2014; Marky et al., 2018); a comparative evaluation of individually verifiable internet-voting schemes concludes that verification steps burden precisely the human factors on which the security argument depends (Marky et al., 2021); improved interfaces raise manipulation detection but leave voters unsure how to act on anomalies (Kulyk et al., 2020). Closest to our setting, an online study around a real German association election using second-device verification, the same approach deployed here, found good perceived usability alongside insufficient understanding of what verification establishes (Hilt et al., 2024). The German Federal Constitutional Court has made public comprehensibility without special expertise a constitutional condition for electronic voting (BVerfG, 2009). What has been missing is a field test of whether experiencing a verifiable system in a real election produces comprehension and technology trust in the voters it is meant to reassure.</w:t>
       </w:r>
     </w:p>
     <w:p>
@@ -1390,7 +1406,7 @@
         <w:jc w:val="both"/>
       </w:pPr>
       <w:r>
-        <w:t>This reading disciplines the experience-effect literature in both directions. Against the hypothetical-scenario tradition, it shows that intention measured on imagined systems substantially understates the acceptance that real use produces; construal-level theory predicted exactly this shift from abstract category to concrete episode (Trope &amp; Liberman, 2010). Against adoption optimism, it shows that the shift stops at the border of trust. The Estonian experience, where trust followed use only slowly and unevenly across a decade of habituation (Solvak &amp; Vassil, 2016), looks less like a communication failure and more like the normal operation of the asymmetry documented here in a single election.</w:t>
+        <w:t>This reading disciplines the experience-effect literature in both directions. Against the hypothetical-scenario tradition, it shows that intention measured on imagined systems substantially understates the acceptance that real use produces; construal-level theory predicted exactly this shift from abstract category to concrete episode (Trope &amp; Liberman, 2010), and the attitude-strength tradition adds that experience-based acceptance is also the more accessible, more confident, and more behavior-predictive kind (Fazio &amp; Zanna, 1981; Glasman &amp; Albarracín, 2006). Against adoption optimism, it shows that the shift stops at the border of trust. The pattern has precedents that were never read together as one finding: in Salta, e-voters judged the technology easier and supported it while ballot-secrecy concerns persisted (Alvarez et al., 2013), and in Estonia trust followed use only slowly across a decade of habituation (Solvak &amp; Vassil, 2016; Ehin et al., 2022). Both look less like communication failures and more like the normal operation of the asymmetry documented here within a single election.</w:t>
       </w:r>
     </w:p>
     <w:p>
@@ -1406,7 +1422,7 @@
         <w:jc w:val="both"/>
       </w:pPr>
       <w:r>
-        <w:t>The verifiability result extends laboratory findings into a real election with a population of first-time voters. Verification was not an exotic feature: nearly one in five used it. Yet neither comprehension nor perceived manipulation resistance moved. The mechanism verifiability is supposed to trigger, replacing trust in authorities with checkable evidence, presupposes that voters understand what the check proves; the orthogonality of comprehension and verification desire (r ≈ .04) suggests the check functions expressively or ritually for many users rather than epistemically. For the German debate, the implication is direct. The Federal Constitutional Court's public-comprehensibility standard (BVerfG, 2009) will not be met by deploying cryptographic verifiability alone; it requires an institutional translation layer, independent audits, public key ceremonies, comprehensible verification interfaces, and formal objection rights, that converts mathematical verifiability into civic comprehensibility. Building that layer is trust work, and per Section 4.4 it is work that pilots do not do by themselves.</w:t>
+        <w:t>The verifiability result extends laboratory findings into a real election with a population of first-time voters. Verification was not an exotic feature: nearly one in five used it. Yet neither comprehension nor perceived manipulation resistance moved. That combination, willing use without understanding, mirrors what usability research keeps finding in controlled settings, from voters who cannot complete or explain verification (Acemyan et al., 2014; Marky et al., 2018) to participants who check their vote but do not know what to do with the result (Kulyk et al., 2020; Hilt et al., 2024). The mechanism verifiability is supposed to trigger, replacing trust in authorities with checkable evidence, presupposes that voters understand what the check proves; the orthogonality of comprehension and verification desire (r ≈ .04) suggests the check functions expressively or ritually for many users rather than epistemically. For the German debate, the implication is direct. The Federal Constitutional Court's public-comprehensibility standard (BVerfG, 2009) will not be met by deploying cryptographic verifiability alone; it requires an institutional translation layer, independent audits, public key ceremonies, comprehensible verification interfaces, and formal objection rights, that converts mathematical verifiability into civic comprehensibility. Building that layer is trust work, and per Section 4.4 it is work that pilots do not do by themselves.</w:t>
       </w:r>
     </w:p>
     <w:p>
@@ -1438,7 +1454,7 @@
         <w:jc w:val="both"/>
       </w:pPr>
       <w:r>
-        <w:t>For acceptance research, the results argue for treating trust not as another antecedent in the UTAUT nomological net but as a separate belief system with its own formation mechanism: dispositional anchoring rather than episodic updating. Models that regress intention on trust and usability jointly will keep finding context-dependent coefficients as long as they ignore that one predictor updates with experience and the other barely does. For trust research, the three-layer measurement (technology, institution, procedure) behaved as theorized, and the layers moved together in their resistance to experience, which is what the dispositional-anchoring account predicts and a system-property account would not. For the construal-level account of the experience effect, the modality invariance of concrete liveness is a useful negative: experience lowered construal for evaluative judgments while the phenomenal reality of the act was already medium-independent. Feeling that a vote is real and judging a system acceptable are, empirically, different operations.</w:t>
+        <w:t>For acceptance research, the results argue for treating trust not as another antecedent in the UTAUT nomological net but as a separate belief system with its own formation mechanism: dispositional anchoring rather than episodic updating. Models that regress intention on trust and usability jointly will keep finding context-dependent coefficients as long as they ignore that one predictor updates with experience and the other barely does. For trust research, the three-layer measurement (technology, institution, procedure) behaved as theorized, and the layers moved together in their resistance to experience, which is what the dispositional-anchoring account predicts and a system-property account would not; the result also illustrates the meta-analytic point that conclusions about trust depend on which trust entities a model specifies (Kuen et al., 2023). The immovable manipulation-resistance belief invites a further differentiation the present instrument cannot deliver: trust and distrust are increasingly modeled as separate constructs with separate consequences rather than poles of one scale (Hosseini Shoabjareh et al., 2024), and a distrust measure may be what a manipulation-focused belief actually requires. For the construal-level account of the experience effect, the modality invariance of concrete liveness is a useful negative: experience lowered construal for evaluative judgments while the phenomenal reality of the act was already medium-independent. Feeling that a vote is real and judging a system acceptable are, empirically, different operations.</w:t>
       </w:r>
     </w:p>
     <w:p>
@@ -1631,6 +1647,23 @@
         <w:jc w:val="both"/>
       </w:pPr>
       <w:r>
+        <w:t xml:space="preserve">Abdala, M. B., Feierherd, G., &amp; Fernández-Vázquez, P. (2025). Trust in government or in technology? What really drives internet voting. </w:t>
+      </w:r>
+      <w:r>
+        <w:rPr>
+          <w:i/>
+        </w:rPr>
+        <w:t>Political Research Quarterly</w:t>
+      </w:r>
+      <w:r>
+        <w:t>. Advance online publication.</w:t>
+      </w:r>
+    </w:p>
+    <w:p>
+      <w:pPr>
+        <w:jc w:val="both"/>
+      </w:pPr>
+      <w:r>
         <w:t xml:space="preserve">Adida, B. (2008). Helios: Web-based open-audit voting. </w:t>
       </w:r>
       <w:r>
@@ -1648,16 +1681,33 @@
         <w:jc w:val="both"/>
       </w:pPr>
       <w:r>
-        <w:t xml:space="preserve">Apaua, R., &amp; Lallie, H. S. (2022). Measuring user perceived security of e-voting systems: A systematic review. </w:t>
+        <w:t xml:space="preserve">Alvarez, R. M., Levin, I., Pomares, J., &amp; Leiras, M. (2013). Voting made safe and easy: The impact of e-voting on citizen perceptions. </w:t>
       </w:r>
       <w:r>
         <w:rPr>
           <w:i/>
         </w:rPr>
-        <w:t>arXiv preprint</w:t>
+        <w:t>Political Science Research and Methods, 1</w:t>
       </w:r>
       <w:r>
-        <w:t>.</w:t>
+        <w:t>(1), 117–137.</w:t>
+      </w:r>
+    </w:p>
+    <w:p>
+      <w:pPr>
+        <w:jc w:val="both"/>
+      </w:pPr>
+      <w:r>
+        <w:t xml:space="preserve">Avgerou, C. (2013). Explaining trust in IT-mediated elections: A case study of e-voting in Brazil. </w:t>
+      </w:r>
+      <w:r>
+        <w:rPr>
+          <w:i/>
+        </w:rPr>
+        <w:t>Journal of the Association for Information Systems, 14</w:t>
+      </w:r>
+      <w:r>
+        <w:t>(8), 420–451.</w:t>
       </w:r>
     </w:p>
     <w:p>
@@ -1775,6 +1825,40 @@
         <w:jc w:val="both"/>
       </w:pPr>
       <w:r>
+        <w:t xml:space="preserve">Ehin, P., Solvak, M., Willemson, J., &amp; Vinkel, P. (2022). Internet voting in Estonia 2005–2019: Evidence from eleven elections. </w:t>
+      </w:r>
+      <w:r>
+        <w:rPr>
+          <w:i/>
+        </w:rPr>
+        <w:t>Government Information Quarterly, 39</w:t>
+      </w:r>
+      <w:r>
+        <w:t>(4), 101718.</w:t>
+      </w:r>
+    </w:p>
+    <w:p>
+      <w:pPr>
+        <w:jc w:val="both"/>
+      </w:pPr>
+      <w:r>
+        <w:t xml:space="preserve">Fazio, R. H., &amp; Zanna, M. P. (1981). Direct experience and attitude–behavior consistency. </w:t>
+      </w:r>
+      <w:r>
+        <w:rPr>
+          <w:i/>
+        </w:rPr>
+        <w:t>Advances in Experimental Social Psychology, 14</w:t>
+      </w:r>
+      <w:r>
+        <w:t>, 161–202.</w:t>
+      </w:r>
+    </w:p>
+    <w:p>
+      <w:pPr>
+        <w:jc w:val="both"/>
+      </w:pPr>
+      <w:r>
         <w:t xml:space="preserve">Fornell, C., &amp; Larcker, D. F. (1981). Evaluating structural equation models with unobservable variables and measurement error. </w:t>
       </w:r>
       <w:r>
@@ -1785,6 +1869,23 @@
       </w:r>
       <w:r>
         <w:t>(1), 39–50.</w:t>
+      </w:r>
+    </w:p>
+    <w:p>
+      <w:pPr>
+        <w:jc w:val="both"/>
+      </w:pPr>
+      <w:r>
+        <w:t xml:space="preserve">Glasman, L. R., &amp; Albarracín, D. (2006). Forming attitudes that predict future behavior: A meta-analysis of the attitude–behavior relation. </w:t>
+      </w:r>
+      <w:r>
+        <w:rPr>
+          <w:i/>
+        </w:rPr>
+        <w:t>Psychological Bulletin, 132</w:t>
+      </w:r>
+      <w:r>
+        <w:t>(5), 778–822.</w:t>
       </w:r>
     </w:p>
     <w:p>
@@ -1809,6 +1910,176 @@
         <w:jc w:val="both"/>
       </w:pPr>
       <w:r>
+        <w:t xml:space="preserve">Hernández-Ortega, B. (2011). The role of post-use trust in the acceptance of a technology: Drivers and consequences. </w:t>
+      </w:r>
+      <w:r>
+        <w:rPr>
+          <w:i/>
+        </w:rPr>
+        <w:t>Technovation, 31</w:t>
+      </w:r>
+      <w:r>
+        <w:t>(10–11), 523–538.</w:t>
+      </w:r>
+    </w:p>
+    <w:p>
+      <w:pPr>
+        <w:jc w:val="both"/>
+      </w:pPr>
+      <w:r>
+        <w:t xml:space="preserve">Hilt, T., Berens, B., Truderung, T., Udluft, M., &amp; Volkamer, M. (2024). Usability and understanding of individual verifiability in the 2023 GI-election. </w:t>
+      </w:r>
+      <w:r>
+        <w:rPr>
+          <w:i/>
+        </w:rPr>
+        <w:t>Proceedings of the Ninth International Joint Conference on Electronic Voting (E-Vote-ID 2024)</w:t>
+      </w:r>
+      <w:r>
+        <w:t>.</w:t>
+      </w:r>
+    </w:p>
+    <w:p>
+      <w:pPr>
+        <w:jc w:val="both"/>
+      </w:pPr>
+      <w:r>
+        <w:t xml:space="preserve">Hosseini Shoabjareh, A., Milad, G., &amp; Rashidi, T. H. (2024). The role of trust and distrust in technology usage: An in-depth investigation of traffic information apps usage for mandatory and non-mandatory trips. </w:t>
+      </w:r>
+      <w:r>
+        <w:rPr>
+          <w:i/>
+        </w:rPr>
+        <w:t>Travel Behaviour and Society, 34</w:t>
+      </w:r>
+      <w:r>
+        <w:t>, 100704.</w:t>
+      </w:r>
+    </w:p>
+    <w:p>
+      <w:pPr>
+        <w:jc w:val="both"/>
+      </w:pPr>
+      <w:r>
+        <w:t xml:space="preserve">Karayumak, F., Olembo, M. M., Kauer, M., &amp; Volkamer, M. (2011). Usability analysis of Helios: An open source verifiable remote electronic voting system. </w:t>
+      </w:r>
+      <w:r>
+        <w:rPr>
+          <w:i/>
+        </w:rPr>
+        <w:t>Proceedings of the USENIX Electronic Voting Technology Workshop/Workshop on Trustworthy Elections (EVT/WOTE '11)</w:t>
+      </w:r>
+      <w:r>
+        <w:t>.</w:t>
+      </w:r>
+    </w:p>
+    <w:p>
+      <w:pPr>
+        <w:jc w:val="both"/>
+      </w:pPr>
+      <w:r>
+        <w:t xml:space="preserve">Kuen, L., Westmattelmann, D., Bruckes, M., &amp; Schewe, G. (2023). Who earns trust in online environments? A meta-analysis of trust in technology and trust in provider for technology acceptance. </w:t>
+      </w:r>
+      <w:r>
+        <w:rPr>
+          <w:i/>
+        </w:rPr>
+        <w:t>Electronic Markets, 33</w:t>
+      </w:r>
+      <w:r>
+        <w:t>, Article 61.</w:t>
+      </w:r>
+    </w:p>
+    <w:p>
+      <w:pPr>
+        <w:jc w:val="both"/>
+      </w:pPr>
+      <w:r>
+        <w:t xml:space="preserve">Kulyk, O., Volkamer, M., Müller, M., &amp; Renaud, K. (2020). Towards improving the efficacy of code-based verification in internet voting. </w:t>
+      </w:r>
+      <w:r>
+        <w:rPr>
+          <w:i/>
+        </w:rPr>
+        <w:t>Financial Cryptography and Data Security Workshops (Voting 2020)</w:t>
+      </w:r>
+      <w:r>
+        <w:t>.</w:t>
+      </w:r>
+    </w:p>
+    <w:p>
+      <w:pPr>
+        <w:jc w:val="both"/>
+      </w:pPr>
+      <w:r>
+        <w:t xml:space="preserve">Lankton, N. K., McKnight, D. H., &amp; Tripp, J. (2015). Technology, humanness, and trust: Rethinking trust in technology. </w:t>
+      </w:r>
+      <w:r>
+        <w:rPr>
+          <w:i/>
+        </w:rPr>
+        <w:t>Journal of the Association for Information Systems, 16</w:t>
+      </w:r>
+      <w:r>
+        <w:t>(10), 880–918.</w:t>
+      </w:r>
+    </w:p>
+    <w:p>
+      <w:pPr>
+        <w:jc w:val="both"/>
+      </w:pPr>
+      <w:r>
+        <w:t xml:space="preserve">Marky, K., Kulyk, O., Renaud, K., &amp; Volkamer, M. (2018). What did I really vote for? On the usability of verifiable e-voting schemes. </w:t>
+      </w:r>
+      <w:r>
+        <w:rPr>
+          <w:i/>
+        </w:rPr>
+        <w:t>Proceedings of the 2018 CHI Conference on Human Factors in Computing Systems</w:t>
+      </w:r>
+      <w:r>
+        <w:t>.</w:t>
+      </w:r>
+    </w:p>
+    <w:p>
+      <w:pPr>
+        <w:jc w:val="both"/>
+      </w:pPr>
+      <w:r>
+        <w:t xml:space="preserve">Marky, K., Zollinger, M.-L., Roenne, P., Ryan, P. Y. A., Grube, T., &amp; Kunze, K. (2021). Investigating usability and user experience of individually verifiable internet voting schemes. </w:t>
+      </w:r>
+      <w:r>
+        <w:rPr>
+          <w:i/>
+        </w:rPr>
+        <w:t>ACM Transactions on Computer-Human Interaction, 28</w:t>
+      </w:r>
+      <w:r>
+        <w:t>(5), 1–36.</w:t>
+      </w:r>
+    </w:p>
+    <w:p>
+      <w:pPr>
+        <w:jc w:val="both"/>
+      </w:pPr>
+      <w:r>
+        <w:t xml:space="preserve">McKnight, D. H., Carter, M., Thatcher, J. B., &amp; Clay, P. F. (2011). Trust in a specific technology: An investigation of its components and measures. </w:t>
+      </w:r>
+      <w:r>
+        <w:rPr>
+          <w:i/>
+        </w:rPr>
+        <w:t>ACM Transactions on Management Information Systems, 2</w:t>
+      </w:r>
+      <w:r>
+        <w:t>(2), Article 12.</w:t>
+      </w:r>
+    </w:p>
+    <w:p>
+      <w:pPr>
+        <w:jc w:val="both"/>
+      </w:pPr>
+      <w:r>
         <w:t xml:space="preserve">McKnight, D. H., Choudhury, V., &amp; Kacmar, C. (2002). Developing and validating trust measures for e-commerce: An integrative typology. </w:t>
       </w:r>
       <w:r>
@@ -1843,6 +2114,23 @@
         <w:jc w:val="both"/>
       </w:pPr>
       <w:r>
+        <w:t xml:space="preserve">Regan, D. T., &amp; Fazio, R. H. (1977). On the consistency between attitudes and behavior: Look to the method of attitude formation. </w:t>
+      </w:r>
+      <w:r>
+        <w:rPr>
+          <w:i/>
+        </w:rPr>
+        <w:t>Journal of Experimental Social Psychology, 13</w:t>
+      </w:r>
+      <w:r>
+        <w:t>(1), 28–45.</w:t>
+      </w:r>
+    </w:p>
+    <w:p>
+      <w:pPr>
+        <w:jc w:val="both"/>
+      </w:pPr>
+      <w:r>
         <w:t xml:space="preserve">Riker, W. H., &amp; Ordeshook, P. C. (1968). A theory of the calculus of voting. </w:t>
       </w:r>
       <w:r>
@@ -1853,6 +2141,23 @@
       </w:r>
       <w:r>
         <w:t>(1), 25–42.</w:t>
+      </w:r>
+    </w:p>
+    <w:p>
+      <w:pPr>
+        <w:jc w:val="both"/>
+      </w:pPr>
+      <w:r>
+        <w:t xml:space="preserve">Rosenbaum, D. P., Schuck, A. M., Costello, S. K., Hawkins, D. F., &amp; Ring, M. K. (2005). Attitudes toward the police: The effects of direct and vicarious experience. </w:t>
+      </w:r>
+      <w:r>
+        <w:rPr>
+          <w:i/>
+        </w:rPr>
+        <w:t>Police Quarterly, 8</w:t>
+      </w:r>
+      <w:r>
+        <w:t>(3), 343–365.</w:t>
       </w:r>
     </w:p>
     <w:p>
@@ -1877,6 +2182,40 @@
         <w:jc w:val="both"/>
       </w:pPr>
       <w:r>
+        <w:t xml:space="preserve">Smith, R. E., &amp; Swinyard, W. R. (1983). Attitude-behavior consistency: The impact of product trial versus advertising. </w:t>
+      </w:r>
+      <w:r>
+        <w:rPr>
+          <w:i/>
+        </w:rPr>
+        <w:t>Journal of Marketing Research, 20</w:t>
+      </w:r>
+      <w:r>
+        <w:t>(3), 257–267.</w:t>
+      </w:r>
+    </w:p>
+    <w:p>
+      <w:pPr>
+        <w:jc w:val="both"/>
+      </w:pPr>
+      <w:r>
+        <w:t xml:space="preserve">Söllner, M., Hoffmann, A., &amp; Leimeister, J. M. (2016). Why different trust relationships matter for information systems users. </w:t>
+      </w:r>
+      <w:r>
+        <w:rPr>
+          <w:i/>
+        </w:rPr>
+        <w:t>European Journal of Information Systems, 25</w:t>
+      </w:r>
+      <w:r>
+        <w:t>(3), 274–287.</w:t>
+      </w:r>
+    </w:p>
+    <w:p>
+      <w:pPr>
+        <w:jc w:val="both"/>
+      </w:pPr>
+      <w:r>
         <w:t xml:space="preserve">Solvak, M., &amp; Vassil, K. (2016). </w:t>
       </w:r>
       <w:r>
@@ -1904,6 +2243,23 @@
       </w:r>
       <w:r>
         <w:t>(2), 440–463.</w:t>
+      </w:r>
+    </w:p>
+    <w:p>
+      <w:pPr>
+        <w:jc w:val="both"/>
+      </w:pPr>
+      <w:r>
+        <w:t xml:space="preserve">Turnbull-Dugarte, S. J., &amp; Devine, D. (2023). Support for digitising the ballot box: A systematic review of i-voting pilots and a conjoint experiment. </w:t>
+      </w:r>
+      <w:r>
+        <w:rPr>
+          <w:i/>
+        </w:rPr>
+        <w:t>Electoral Studies, 86</w:t>
+      </w:r>
+      <w:r>
+        <w:t>, 102679.</w:t>
       </w:r>
     </w:p>
     <w:p>

</xml_diff>

<commit_message>
Remove AI-pattern weaknesses from paper prose and secure references
De-enumerate the contributions paragraph, drop the invented
propriety/validity jargon pair in favor of plain tool/institution
language, vary the enumerated observation and exploratory-analysis
passages, fix pre-registered to pre-specified, and replace unverifiable
co-author lists with flagged et-al entries plus an explicit
verification note to prevent fabricated citations reaching submission.

Co-Authored-By: Claude Fable 5 <noreply@anthropic.com>
Claude-Session: https://claude.ai/code/session_01HtXFYU9REMYtX7Q3tX74vu
</commit_message>
<xml_diff>
--- a/u18-wahl-publikationen/paper/U18_Paper_v6_Trying_Is_Not_Trusting.docx
+++ b/u18-wahl-publikationen/paper/U18_Paper_v6_Trying_Is_Not_Trusting.docx
@@ -112,7 +112,7 @@
         <w:jc w:val="both"/>
       </w:pPr>
       <w:r>
-        <w:t>The stakes of the question are practical. Administrations weighing digital voting pilots implicitly choose between two theories of adoption. The campaign theory holds that acceptance is an information problem: explain the system well enough, and support follows. The pilot theory holds that acceptance is an experience problem: nothing persuades like using the system. A large experience effect would favor pilots over campaigns. But there is a second question hiding under the first, and it is the one this paper is about. Acceptance and trust are not the same belief. Finding a system useful, easy, and enjoyable is a judgment about the system's propriety for a task. Trusting a system with the integrity of an election is a judgment about its validity, and about the institutions behind it (McKnight et al., 2002; Warkentin et al., 2018). If experience moves the first belief system but not the second, then pilots are a powerful but bounded instrument, and administrations that expect pilots to generate trust will be disappointed in a specific, predictable way.</w:t>
+        <w:t>The stakes of the question are practical. Administrations weighing digital voting pilots implicitly choose between two theories of adoption. The campaign theory holds that acceptance is an information problem: explain the system well enough, and support follows. The pilot theory holds that acceptance is an experience problem: nothing persuades like using the system. A large experience effect would favor pilots over campaigns. But there is a second question hiding under the first, and it is the one this paper is about. Acceptance and trust are not the same belief. Finding a system useful, easy, and enjoyable is a judgment about a tool. Trusting a system with the integrity of an election is a judgment about an institution, and about the people and rules behind it (McKnight et al., 2002; Warkentin et al., 2018). If experience moves the first belief system but not the second, then pilots are a powerful but bounded instrument, and administrations that expect pilots to generate trust will be disappointed in a specific, predictable way.</w:t>
       </w:r>
     </w:p>
     <w:p>
@@ -136,7 +136,7 @@
         <w:jc w:val="both"/>
       </w:pPr>
       <w:r>
-        <w:t>The paper makes three contributions. First, it provides field-experimental evidence on the experience effect in digital voting with the cleanest assignment mechanism reported to date, and shows that the effect is real, large, and confined to acceptance. Second, it establishes acceptance and trust as empirically distinct belief systems in the voting domain, not merely conceptually distinct ones, and shows they respond differently to the same treatment. Third, it derives a sequencing logic for practice: trust work first, pilots second, campaigns third; because each instrument moves a different belief at a different cost.</w:t>
+        <w:t>The study supplies field evidence on the experience effect in digital voting with the cleanest assignment mechanism reported to date, and the effect turns out to be real, large, and confined to acceptance. Because acceptance and trust also separate empirically in these data, not just conceptually, adoption models that blend them into a single antecedent structure will keep producing contradictory coefficients: the two belief systems respond differently to the same treatment. For administrations, a sequence replaces the pilots-versus-campaigns binary. Trust work comes first, pilots second, campaigns third, because each instrument moves a different belief at a different cost.</w:t>
       </w:r>
     </w:p>
     <w:p>
@@ -160,7 +160,7 @@
         <w:pStyle w:val="Heading3"/>
       </w:pPr>
       <w:r>
-        <w:t>2.1 Acceptance: propriety beliefs about a system</w:t>
+        <w:t>2.1 Acceptance: judgments about a tool</w:t>
       </w:r>
     </w:p>
     <w:p>
@@ -168,7 +168,7 @@
         <w:jc w:val="both"/>
       </w:pPr>
       <w:r>
-        <w:t>Technology acceptance research explains the intention to use a system through beliefs about the system's usefulness and usability, extended in UTAUT2 by hedonic motivation, social influence, and facilitating conditions (Venkatesh et al., 2003; Venkatesh et al., 2012). Applied to voting, these constructs capture what we call propriety beliefs: whether digital voting is sensible, easy, enjoyable, socially approved, and feasible for me. The e-voting literature has repeatedly confirmed that these beliefs predict stated intention to vote online (Carter &amp; Bélanger, 2005; Choi &amp; Kim, 2019; Zhu et al., 2021). What the literature has not resolved is where these beliefs come from, because almost all measurements are hypothetical: respondents rate a system they have never used. Construal level theory gives a specific reason to distrust that measurement situation. Psychologically distant objects are represented abstractly, in terms of schemas and generalized risk; direct experience shifts representation to concrete features (Trope &amp; Liberman, 2010). A hypothetical digital voting system is evaluated as a category ("online voting, is that safe?"); an experienced one is evaluated as an episode ("that took two minutes and worked"). If construal drives propriety beliefs, experience should raise acceptance substantially.</w:t>
+        <w:t>Technology acceptance research explains the intention to use a system through beliefs about the system's usefulness and usability, extended in UTAUT2 by hedonic motivation, social influence, and facilitating conditions (Venkatesh et al., 2003; Venkatesh et al., 2012). Applied to voting, these constructs capture judgments about digital voting as a tool: whether it is sensible, easy, enjoyable, socially approved, and feasible for me. The e-voting literature has repeatedly confirmed that these beliefs predict stated intention to vote online (Carter &amp; Bélanger, 2005; Choi &amp; Kim, 2019; Zhu et al., 2021). What the literature has not resolved is where these beliefs come from, because almost all measurements are hypothetical: respondents rate a system they have never used. Construal level theory gives a specific reason to distrust that measurement situation. Psychologically distant objects are represented abstractly, in terms of schemas and generalized risk; direct experience shifts representation to concrete features (Trope &amp; Liberman, 2010). A hypothetical digital voting system is evaluated as a category ("online voting, is that safe?"); an experienced one is evaluated as an episode ("that took two minutes and worked"). If construal drives these tool judgments, experience should raise acceptance substantially.</w:t>
       </w:r>
     </w:p>
     <w:p>
@@ -184,7 +184,7 @@
         <w:pStyle w:val="Heading3"/>
       </w:pPr>
       <w:r>
-        <w:t>2.2 Trust: validity beliefs about a system and its institutions</w:t>
+        <w:t>2.2 Trust: judgments about an institution</w:t>
       </w:r>
     </w:p>
     <w:p>
@@ -200,7 +200,7 @@
         <w:jc w:val="both"/>
       </w:pPr>
       <w:r>
-        <w:t>Following Carter and Bélanger (2005) and the institution-based trust tradition (Zucker, 1986; McKnight et al., 2002), we therefore measure three trust layers: technology trust (the system works reliably, keeps the ballot secret, resists manipulation), institutional trust (the responsible institutions run elections fairly and protect my vote), and generic trust in the procedure of digital voting. These are validity beliefs: judgments about whether the election, as an institution, remains intact when it becomes digital. Two properties distinguish validity beliefs from propriety beliefs. They refer to properties a user cannot observe in use: a smooth voting session reveals nothing about server-side integrity, and post-use trust accordingly draws on perceptions accumulated around the technology's institutional context rather than on the transaction alone (Hernández-Ortega, 2011). And they are anchored in dispositions and prior attitudes toward the state and toward technology rather than in episodic evidence (Warkentin et al., 2018); prior attitudes have been shown to govern how people interpret subsequent direct experience with an institution, rather than being overwritten by it (Rosenbaum et al., 2005). Both properties predict that experience should move trust much less than acceptance. A pleasant user experience is simply not evidence about the things trust is about. Field data point the same way: in the Salta e-voting field experiment, voters found the new technology easier and supported its adoption while concerns about ballot secrecy persisted (Alvarez et al., 2013), and in a UK conjoint experiment internet voting was perceived as less trustworthy than in-person voting across the board, with integrity concerns dominating support (Turnbull-Dugarte &amp; Devine, 2023).</w:t>
+        <w:t>Following Carter and Bélanger (2005) and the institution-based trust tradition (Zucker, 1986; McKnight et al., 2002), we therefore measure three trust layers: technology trust (the system works reliably, keeps the ballot secret, resists manipulation), institutional trust (the responsible institutions run elections fairly and protect my vote), and generic trust in the procedure of digital voting. Together they capture whether the election, as an institution, remains intact when it becomes digital. Two properties distinguish these trust judgments from acceptance judgments. They refer to properties a user cannot observe in use: a smooth voting session reveals nothing about server-side integrity, and post-use trust accordingly draws on perceptions accumulated around the technology's institutional context rather than on the transaction alone (Hernández-Ortega, 2011). And they are anchored in dispositions and prior attitudes toward the state and toward technology rather than in episodic evidence (Warkentin et al., 2018); prior attitudes have been shown to govern how people interpret subsequent direct experience with an institution, rather than being overwritten by it (Rosenbaum et al., 2005). Both properties predict that experience should move trust much less than acceptance. A pleasant user experience is simply not evidence about the things trust is about. Field data point the same way: in the Salta e-voting field experiment, voters found the new technology easier and supported its adoption while concerns about ballot secrecy persisted (Alvarez et al., 2013), and in a UK conjoint experiment internet voting was perceived as less trustworthy than in-person voting across the board, with integrity concerns dominating support (Turnbull-Dugarte &amp; Devine, 2023).</w:t>
       </w:r>
     </w:p>
     <w:p>
@@ -254,7 +254,7 @@
         <w:jc w:val="both"/>
       </w:pPr>
       <w:r>
-        <w:t>H1 presupposes that acceptance and trust are distinct measurement objects; we test discriminant validity as a precondition (Section 5.2). Two further analyses were specified as exploratory and are labeled as such throughout. First, institutional trust may act as an authorization context that amplifies the effect of social endorsement on intention (an IT × SI interaction). Second, we compare how much variance in intention is explained by validity cues (institutional trust, social influence) versus by the categorical fit of the digital act to the concept of "a real election" (concreteness, ritual, comprehension). Both explorations are hypothesis-generating, not tests.</w:t>
+        <w:t>H1 presupposes that acceptance and trust are distinct measurement objects; we test discriminant validity as a precondition (Section 5.2). Two further analyses were specified as exploratory and are labeled as such throughout. One asks whether institutional trust amplifies the effect of social endorsement on intention (an IT × SI interaction). The other compares how much variance in intention is explained by second-hand assurance (institutional trust, social influence) against the fit of the digital act to the concept of "a real election" (concreteness, ritual, comprehension). Both explorations generate hypotheses; neither tests one.</w:t>
       </w:r>
     </w:p>
     <w:p>
@@ -1342,7 +1342,7 @@
         <w:jc w:val="both"/>
       </w:pPr>
       <w:r>
-        <w:t>The digital system's verification function gives the trust result a sharp edge. Around 19% of digital voters actually checked that their ballot had arrived, a substantial uptake for an optional technical function. Three observations follow. First, experiencing the verifiable system did not reliably raise comprehension: the adjusted effect on the comprehension subscale is +0.19 (p = .077, not significant after correction), with a bootstrap interval spanning zero. Second, the single item measuring perceived manipulation resistance ("hard to manipulate") is the only item in the entire instrument with no modality difference at all (M = 2.55 in both groups, p = .99), and its absolute level is the lowest in the trust block: skepticism about manipulability is both universal and untouched by experience. Third, comprehension and the desire to verify are uncorrelated (r = .04 in the factor analysis of the PLT items; r = .01 in a replication round): wanting to check is not an expression of understanding, and understanding does not create the wish to check. Because responses were anonymous, verification use could not be linked to individual survey responses; the natural follow-up, whether verifiers trust more, remains open. What the group-level data show is a boundary: a real, used verification function did not convert into measurable comprehension or technology trust. Offering verifiability is necessary for the constitutional standard of a citizen-comprehensible election; it is evidently not sufficient.</w:t>
+        <w:t>The digital system's verification function gives the trust result a sharp edge. Around 19% of digital voters actually checked that their ballot had arrived, a substantial uptake for an optional technical function. Yet experiencing the verifiable system did not reliably raise comprehension: the adjusted effect on the comprehension subscale is +0.19 (p = .077, not significant after correction), with a bootstrap interval spanning zero. More telling still, the single item measuring perceived manipulation resistance ("hard to manipulate") is the only item in the entire instrument with no modality difference at all (M = 2.55 in both groups, p = .99), and its absolute level is the lowest in the trust block: skepticism about manipulability is both universal and untouched by experience. Comprehension and the desire to verify, finally, are uncorrelated (r = .04 in the factor analysis of the PLT items; r = .01 in a replication round). Wanting to check is not an expression of understanding, and understanding does not create the wish to check. Because responses were anonymous, verification use could not be linked to individual survey responses; the natural follow-up, whether verifiers trust more, remains open. What the group-level data show is a boundary: a real, used verification function did not convert into measurable comprehension or technology trust. Offering verifiability is necessary for the constitutional standard of a citizen-comprehensible election; it is evidently not sufficient.</w:t>
       </w:r>
     </w:p>
     <w:p>
@@ -1374,7 +1374,7 @@
         <w:jc w:val="both"/>
       </w:pPr>
       <w:r>
-        <w:t>Two pre-registered exploratory analyses are reported as hypothesis-generating. First, institutional trust moderates social influence: the IT × SI interaction on intention is small but survives FDR correction (b = 0.08, p_FDR = .031); the effect of social endorsement on intention rises from 0.39 (low IT) to 0.55 (high IT). Peer endorsement appears to matter more when the institutional frame is trusted, a pattern worth a targeted test in adult populations. Second, validity cues (institutional trust, social influence) explain substantially more variance in intention (R² = .42) than the categorical-fit block (concreteness, ritual, comprehension; R² = .29, largely carried by the prior-attitude covariate), and adding fit constructs to the cue model raises R² by less than .01. In a supplementary fsQCA exploration, configurations combining generic and technology trust with concreteness and democratic significance were sufficient for high intention (solution coverage .55, consistency .84); given the method's sensitivity to calibration choices we use it only as a source of configurational hypotheses, not as evidence.</w:t>
+        <w:t>Two pre-specified exploratory analyses are reported as hypothesis-generating. One concerns social influence: the IT × SI interaction on intention is small but survives FDR correction (b = 0.08, p_FDR = .031), and the effect of social endorsement on intention rises from 0.39 (low IT) to 0.55 (high IT). Peer endorsement appears to matter more when the institutional frame is trusted, a pattern worth a targeted test in adult populations. The other weighs second-hand assurance against experiential fit: institutional trust and social influence explain substantially more variance in intention (R² = .42) than the concreteness-ritual-comprehension block (R² = .29, largely carried by the prior-attitude covariate), and adding the fit constructs to the assurance model raises R² by less than .01. In a supplementary fsQCA exploration, configurations combining generic and technology trust with concreteness and democratic significance were sufficient for high intention (solution coverage .55, consistency .84); given the method's sensitivity to calibration choices we use it only as a source of configurational hypotheses, not as evidence.</w:t>
       </w:r>
     </w:p>
     <w:p>
@@ -1398,7 +1398,7 @@
         <w:jc w:val="both"/>
       </w:pPr>
       <w:r>
-        <w:t>The study set out to measure what experiencing digital voting does that imagining it does not. The answer has a shape: experience is a powerful treatment for propriety beliefs and a weak one for validity beliefs. Three quarters of a standard deviation, the adjusted acceptance effect, is a large distance in attitude research; it is the difference between a skeptical and a supportive median respondent. One quarter of a standard deviation, most of it absorbed by prior attitude, is what the same episode did to trust. The factor structure shows these are genuinely different judgments; the attenuation analysis shows why they respond differently. Acceptance feeds on episodic evidence, and the episode delivered: the vote was fast, easy, and worked. Trust feeds on priors about institutions and unobservable system properties, and a smooth two-minute session is simply not evidence about those. Voters, including 14-year-olds, appear to know the difference.</w:t>
+        <w:t>The study set out to measure what experiencing digital voting does that imagining it does not. The answer has a shape: experience is a powerful treatment for acceptance and a weak one for trust. Three quarters of a standard deviation, the adjusted acceptance effect, is a large distance in attitude research; it is the difference between a skeptical and a supportive median respondent. One quarter of a standard deviation, most of it absorbed by prior attitude, is what the same episode did to trust. The factor structure shows these are genuinely different judgments; the attenuation analysis shows why they respond differently. Acceptance feeds on episodic evidence, and the episode delivered: the vote was fast, easy, and worked. Trust feeds on priors about institutions and unobservable system properties, and a smooth two-minute session is simply not evidence about those. Voters, including 14-year-olds, appear to know the difference.</w:t>
       </w:r>
     </w:p>
     <w:p>
@@ -1422,7 +1422,7 @@
         <w:jc w:val="both"/>
       </w:pPr>
       <w:r>
-        <w:t>The verifiability result extends laboratory findings into a real election with a population of first-time voters. Verification was not an exotic feature: nearly one in five used it. Yet neither comprehension nor perceived manipulation resistance moved. That combination, willing use without understanding, mirrors what usability research keeps finding in controlled settings, from voters who cannot complete or explain verification (Acemyan et al., 2014; Marky et al., 2018) to participants who check their vote but do not know what to do with the result (Kulyk et al., 2020; Hilt et al., 2024). The mechanism verifiability is supposed to trigger, replacing trust in authorities with checkable evidence, presupposes that voters understand what the check proves; the orthogonality of comprehension and verification desire (r ≈ .04) suggests the check functions expressively or ritually for many users rather than epistemically. For the German debate, the implication is direct. The Federal Constitutional Court's public-comprehensibility standard (BVerfG, 2009) will not be met by deploying cryptographic verifiability alone; it requires an institutional translation layer, independent audits, public key ceremonies, comprehensible verification interfaces, and formal objection rights, that converts mathematical verifiability into civic comprehensibility. Building that layer is trust work, and per Section 4.4 it is work that pilots do not do by themselves.</w:t>
+        <w:t>The verifiability result extends laboratory findings into a real election with a population of first-time voters. Verification was not an exotic feature: nearly one in five used it. Yet neither comprehension nor perceived manipulation resistance moved. That combination, willing use without understanding, mirrors what usability research keeps finding in controlled settings, from voters who cannot complete or explain verification (Acemyan et al., 2014; Marky et al., 2018) to participants who check their vote but do not know what to do with the result (Kulyk et al., 2020; Hilt et al., 2024). The mechanism verifiability is supposed to trigger, replacing trust in authorities with checkable evidence, presupposes that voters understand what the check proves; the orthogonality of comprehension and verification desire (r ≈ .04) suggests that for many users the check works as ritual and reassurance, not as a way of understanding the system. For the German debate, the implication is direct. The Federal Constitutional Court's public-comprehensibility standard (BVerfG, 2009) will not be met by deploying cryptographic verifiability alone; it requires an institutional translation layer, independent audits, public key ceremonies, comprehensible verification interfaces, and formal objection rights, that converts mathematical verifiability into civic comprehensibility. Building that layer is trust work, and per Section 4.4 it is work that pilots do not do by themselves.</w:t>
       </w:r>
     </w:p>
     <w:p>
@@ -1647,7 +1647,7 @@
         <w:jc w:val="both"/>
       </w:pPr>
       <w:r>
-        <w:t xml:space="preserve">Abdala, M. B., Feierherd, G., &amp; Fernández-Vázquez, P. (2025). Trust in government or in technology? What really drives internet voting. </w:t>
+        <w:t xml:space="preserve">Abdala, M., et al. (2025). Trust in government or in technology? What really drives internet voting. </w:t>
       </w:r>
       <w:r>
         <w:rPr>
@@ -1927,7 +1927,7 @@
         <w:jc w:val="both"/>
       </w:pPr>
       <w:r>
-        <w:t xml:space="preserve">Hilt, T., Berens, B., Truderung, T., Udluft, M., &amp; Volkamer, M. (2024). Usability and understanding of individual verifiability in the 2023 GI-election. </w:t>
+        <w:t xml:space="preserve">Hilt, T., et al. (2024). Usability and understanding of individual verifiability in the 2023 GI-election. </w:t>
       </w:r>
       <w:r>
         <w:rPr>
@@ -1944,7 +1944,7 @@
         <w:jc w:val="both"/>
       </w:pPr>
       <w:r>
-        <w:t xml:space="preserve">Hosseini Shoabjareh, A., Milad, G., &amp; Rashidi, T. H. (2024). The role of trust and distrust in technology usage: An in-depth investigation of traffic information apps usage for mandatory and non-mandatory trips. </w:t>
+        <w:t xml:space="preserve">Hosseini Shoabjareh, A., et al. (2024). The role of trust and distrust in technology usage: An in-depth investigation of traffic information apps usage for mandatory and non-mandatory trips. </w:t>
       </w:r>
       <w:r>
         <w:rPr>
@@ -1953,7 +1953,7 @@
         <w:t>Travel Behaviour and Society, 34</w:t>
       </w:r>
       <w:r>
-        <w:t>, 100704.</w:t>
+        <w:t>.</w:t>
       </w:r>
     </w:p>
     <w:p>
@@ -1995,7 +1995,7 @@
         <w:jc w:val="both"/>
       </w:pPr>
       <w:r>
-        <w:t xml:space="preserve">Kulyk, O., Volkamer, M., Müller, M., &amp; Renaud, K. (2020). Towards improving the efficacy of code-based verification in internet voting. </w:t>
+        <w:t xml:space="preserve">Kulyk, O., Volkamer, M., et al. (2020). Towards improving the efficacy of code-based verification in internet voting. </w:t>
       </w:r>
       <w:r>
         <w:rPr>
@@ -2046,7 +2046,7 @@
         <w:jc w:val="both"/>
       </w:pPr>
       <w:r>
-        <w:t xml:space="preserve">Marky, K., Zollinger, M.-L., Roenne, P., Ryan, P. Y. A., Grube, T., &amp; Kunze, K. (2021). Investigating usability and user experience of individually verifiable internet voting schemes. </w:t>
+        <w:t xml:space="preserve">Marky, K., et al. (2021). Investigating usability and user experience of individually verifiable internet voting schemes. </w:t>
       </w:r>
       <w:r>
         <w:rPr>
@@ -2055,7 +2055,7 @@
         <w:t>ACM Transactions on Computer-Human Interaction, 28</w:t>
       </w:r>
       <w:r>
-        <w:t>(5), 1–36.</w:t>
+        <w:t>(5).</w:t>
       </w:r>
     </w:p>
     <w:p>
@@ -2345,6 +2345,17 @@
       </w:r>
       <w:r>
         <w:t>, 53–111.</w:t>
+      </w:r>
+    </w:p>
+    <w:p>
+      <w:pPr>
+        <w:jc w:val="both"/>
+      </w:pPr>
+      <w:r>
+        <w:rPr>
+          <w:i/>
+        </w:rPr>
+        <w:t>Working-paper note on references: entries marked "et al." (Abdala 2025; Hilt 2024; Hosseini Shoabjareh 2024; Kulyk 2020; Marky 2021) and the co-author list of Kuen et al. (2023) could not be fully verified against the published records from the current environment; complete and check them before submission. Titles, first authors, venues, and DOIs of these entries were verified via Consensus and Scite on July 18, 2026.</w:t>
       </w:r>
     </w:p>
     <w:p>

</xml_diff>